<commit_message>
v2: serial figure/table citation order, expanded table legends
</commit_message>
<xml_diff>
--- a/IET_Communications_Submission/v2_18page/01_Manuscript_IET_Communications_v2.docx
+++ b/IET_Communications_Submission/v2_18page/01_Manuscript_IET_Communications_v2.docx
@@ -1797,7 +1797,7 @@
           <w:sz w:val="24"/>
           <w:szCs w:val="24"/>
         </w:rPr>
-        <w:t>Fig. 5 previews the analysis, mapping the corpus across security functions and method families: the field’s center of gravity sits squarely in the RFFI × (adversarial + deep-supervised) complex, key generation is a simulation-heavy island, and LLM-assisted work is only now appearing. The remainder of the paper is organised as follows. §2 details the review methodology. §3 presents the corpus overview and bibliometric analysis. §§4–6 review threats, defenses, and the quantum-era context. §7 examines cross-cutting directions. §8 formulates gaps and the checklist. §9 concludes.</w:t>
+        <w:t>The remainder of the paper is organised as follows. §2 details the review methodology. §3 presents the corpus overview and bibliometric analysis. §§4–6 review threats, defenses, and the quantum-era context. §7 examines cross-cutting directions. §8 formulates gaps and the checklist. §9 concludes.</w:t>
       </w:r>
     </w:p>
     <w:p>
@@ -2170,16 +2170,15 @@
           <w:sz w:val="21"/>
           <w:szCs w:val="21"/>
         </w:rPr>
-        <w:t xml:space="preserve">Table 2: </w:t>
-      </w:r>
-      <w:r>
-        <w:rPr>
-          <w:rFonts w:ascii="Times New Roman" w:eastAsia="SimSun"/>
-          <w:color w:val="000000"/>
-          <w:sz w:val="21"/>
-          <w:szCs w:val="21"/>
-        </w:rPr>
-        <w:t xml:space="preserve">Inclusion and exclusion criteria applied during corpus screening.</w:t>
+        <w:t>Table 2: Inclusion and exclusion criteria applied during corpus screening. Columns give the screening dimension, what was included, and what was excluded or routed to background.</w:t>
+      </w:r>
+      <w:r>
+        <w:rPr>
+          <w:rFonts w:ascii="Times New Roman" w:eastAsia="SimSun"/>
+          <w:color w:val="000000"/>
+          <w:sz w:val="21"/>
+          <w:szCs w:val="21"/>
+        </w:rPr>
       </w:r>
     </w:p>
     <w:tbl>
@@ -3436,7 +3435,7 @@
           <w:sz w:val="24"/>
           <w:szCs w:val="24"/>
         </w:rPr>
-        <w:t>Functionally the corpus is dominated by Authentication/RFFI: 69 of 121 core (57.0%), followed by Anti-jamming/secure comms (14), Key generation/distribution (12), Federated/privacy FL (11), Protocol/traffic/cryptanalysis (10), PQC-context (9), Learned primitives (3), Side-channel analysis (2) (Fig. 5, Table S2). The center of gravity sits in RFFI × (adversarial 27 + deep-supervised 33) — deep supervised now leads inside RFFI as well as overall. By contrast, learned primitives (3) are thin — telling, since these are where cryptographic consequences are most direct. Cutting the same data by track (Fig. 4) sharpens the asymmetry that §§4–5 develop: adversarial ML splits 20 threat / 7 dual / 13 defense across tracks (the dedupe moved two attack-plus-defense papers to dual-track), deep supervised learning remains predominantly a defense instrument (42 defense vs 3 threat), and all reinforcement learning in the corpus sits on the defense side. Method-by-track figures pool dual-track papers with threat for readability; the text always gives the three-way split (for adversarial ML: 20 threat / 7 dual / 13 defense).</w:t>
+        <w:t>Functionally the corpus is dominated by Authentication/RFFI: 69 of 121 core (57.0%), followed by Anti-jamming/secure comms (14), Key generation/distribution (12), Federated/privacy FL (11), Protocol/traffic/cryptanalysis (10), PQC-context (9), Learned primitives (3), Side-channel analysis (2) (Figs. 4 and 5, Table S2). The center of gravity sits in RFFI × (adversarial 27 + deep-supervised 33) — deep supervised now leads inside RFFI as well as overall. By contrast, learned primitives (3) are thin — telling, since these are where cryptographic consequences are most direct. Cutting the same data by track sharpens the asymmetry that §§4–5 develop: adversarial ML splits 20 threat / 7 dual / 13 defense across tracks (the dedupe moved two attack-plus-defense papers to dual-track), deep supervised learning remains predominantly a defense instrument (42 defense vs 3 threat), and all reinforcement learning in the corpus sits on the defense side. Method-by-track figures pool dual-track papers with threat for readability; the text always gives the three-way split (for adversarial ML: 20 threat / 7 dual / 13 defense).</w:t>
       </w:r>
     </w:p>
     <w:p>
@@ -4047,7 +4046,7 @@
           <w:sz w:val="21"/>
           <w:szCs w:val="21"/>
         </w:rPr>
-        <w:t>Table 3: Validation practices across the corpus.</w:t>
+        <w:t>Table 3: Validation practices across the corpus (n=130). Grades run from author-conducted testbed/field demonstration (strongest, 47 papers) through cross-domain generalisation (26) and simulation-only (18) to standard splits or unclear reporting (35) and benchmark/analysis (4); the Interpretation column states what each grade licenses.</w:t>
       </w:r>
       <w:r>
         <w:rPr>
@@ -7138,7 +7137,7 @@
           <w:sz w:val="24"/>
           <w:szCs w:val="24"/>
         </w:rPr>
-        <w:t>Three threads cut across the function-level reviews: closed-loop evaluation, autonomous trust, and reproducibility. Closed-loop evaluation (§2.6) reaches at least 14 of 121 core (11.6%, a lower bound): the 7 dual-track papers (D08, D36, D37, T05, T11, T14, T46 — 5 under a stricter title-only dual rule with T05/T14 reverting to threat; T31 stays threat either way since its mitigation is secondary), 3 threat papers that demonstrate against defenses (T30 against adversarial training, subtraction, detection, and oracle defenses; T12 by bypassing Neural Cleanse and STRIP; T31 assessing a distillation defense on an OTA O-RAN testbed), and 4 defense papers that demonstrate against attacks (D67 against GAN-based impersonation; D54 against Byzantine poisoning; D32 against live impersonating UAVs; D48 flagging evasive queries). The broader measure remains the exception (the §4–§5 wall), autonomous trust (real-time deadlines unbenchmarked; OTA crypto-agility essentially unaddressed; multi-agent trust in 1–2 papers while FL-for-drones falls to deauth→impersonation chaining [T36]), and reproducibility (4 verified artifact releases among 121 core, 3.3%) are the three cross-cutting threads (Fig. 9). Dual-track realism is lowest (mean R2 1.14, n=7; §5), which complicates any closed-loop optimism: evaluation exists but is least realistic.</w:t>
+        <w:t>Three threads cut across the function-level reviews: closed-loop evaluation, autonomous trust, and reproducibility. Closed-loop evaluation (§2.6) reaches at least 14 of 121 core (11.6%, a lower bound): the 7 dual-track papers (D08, D36, D37, T05, T11, T14, T46 — 5 under a stricter title-only dual rule with T05/T14 reverting to threat; T31 stays threat either way since its mitigation is secondary), 3 threat papers that demonstrate against defenses (T30 against adversarial training, subtraction, detection, and oracle defenses; T12 by bypassing Neural Cleanse and STRIP; T31 assessing a distillation defense on an OTA O-RAN testbed), and 4 defense papers that demonstrate against attacks (D67 against GAN-based impersonation; D54 against Byzantine poisoning; D32 against live impersonating UAVs; D48 flagging evasive queries). The broader measure remains the exception (the §4–§5 wall), autonomous trust (real-time deadlines unbenchmarked; OTA crypto-agility essentially unaddressed; multi-agent trust in 1–2 papers while FL-for-drones falls to deauth→impersonation chaining [T36]), and reproducibility (4 verified artifact releases among 121 core, 3.3%) are the three cross-cutting threads (Figs. 8 and 9). Dual-track realism is lowest (mean R2 1.14, n=7; §5), which complicates any closed-loop optimism: evaluation exists but is least realistic.</w:t>
       </w:r>
     </w:p>
     <w:p>
@@ -7431,7 +7430,7 @@
           <w:sz w:val="21"/>
           <w:szCs w:val="21"/>
         </w:rPr>
-        <w:t>Table 5: Structural research gaps and corresponding future directions.</w:t>
+        <w:t>Table 5: Structural research gaps and corresponding future directions. Each row pairs the corpus evidence (counts, rates, or coverage finding) with the concrete direction that would narrow it; all six are measurable against the released dataset, so a rerun of this review can score each as narrowed, unchanged, or widened.</w:t>
       </w:r>
       <w:r>
         <w:rPr>
@@ -8211,7 +8210,7 @@
           <w:sz w:val="21"/>
           <w:szCs w:val="21"/>
         </w:rPr>
-        <w:t>Table 6: Proposed WIRELESS-AI-RC reporting checklist (12 items).</w:t>
+        <w:t>Table 6: Proposed WIRELESS-AI-RC reporting checklist (12 items). Each item names the minimum metadata a study must disclose (dataset and testbed identity, device population, adversary model, splits, baselines, compute, and failure analysis, among others) for its claims to be comparable, reproducible, and poolable in future syntheses.</w:t>
       </w:r>
       <w:r>
         <w:rPr>

</xml_diff>